<commit_message>
Dodan zakljucek pri projektni nalogi
</commit_message>
<xml_diff>
--- a/DanielGrozdanovic/projektnaNaloga/proj_nal_gitea_daniel_grozdanovic.docx
+++ b/DanielGrozdanovic/projektnaNaloga/proj_nal_gitea_daniel_grozdanovic.docx
@@ -454,14 +454,7 @@
           <w:b/>
           <w:sz w:val="40"/>
         </w:rPr>
-        <w:t>Vzpostavitev Gitea strežnika na EC2</w:t>
-      </w:r>
-      <w:r>
-        <w:rPr>
-          <w:b/>
-          <w:sz w:val="40"/>
-        </w:rPr>
-        <w:t xml:space="preserve">  </w:t>
+        <w:t xml:space="preserve">Vzpostavitev Gitea strežnika na EC2  </w:t>
       </w:r>
     </w:p>
     <w:p>
@@ -1901,27 +1894,17 @@
         <w:spacing w:after="0" w:line="259" w:lineRule="auto"/>
         <w:jc w:val="left"/>
       </w:pPr>
-      <w:r>
-        <w:fldChar w:fldCharType="begin"/>
-      </w:r>
-      <w:r>
-        <w:instrText xml:space="preserve"> TOC \h \z \c "Tabela" </w:instrText>
-      </w:r>
-      <w:r>
-        <w:fldChar w:fldCharType="separate"/>
-      </w:r>
-      <w:r>
-        <w:rPr>
-          <w:b/>
-          <w:bCs/>
-          <w:noProof/>
-          <w:lang w:val="en-US"/>
-        </w:rPr>
-        <w:t>No table of figures entries found.</w:t>
-      </w:r>
-      <w:r>
-        <w:fldChar w:fldCharType="end"/>
-      </w:r>
+      <w:fldSimple w:instr=" TOC \h \z \c &quot;Tabela&quot; ">
+        <w:r>
+          <w:rPr>
+            <w:b/>
+            <w:bCs/>
+            <w:noProof/>
+            <w:lang w:val="en-US"/>
+          </w:rPr>
+          <w:t>No table of figures entries found.</w:t>
+        </w:r>
+      </w:fldSimple>
       <w:r>
         <w:t xml:space="preserve"> </w:t>
       </w:r>
@@ -3081,49 +3064,7 @@
         <w:ind w:left="-1" w:right="194" w:firstLine="0"/>
       </w:pPr>
       <w:r>
-        <w:t>Za zagotovitev varnega delovanja strežnika se</w:t>
-      </w:r>
-      <w:r>
-        <w:t>m</w:t>
-      </w:r>
-      <w:r>
-        <w:t xml:space="preserve"> najprej pristopilo k ustvarjanju nove varnostne skupine (</w:t>
-      </w:r>
-      <w:r>
-        <w:t xml:space="preserve">ang. </w:t>
-      </w:r>
-      <w:r>
-        <w:t>Security Group). S klikom na gumb »Create security group« s</w:t>
-      </w:r>
-      <w:r>
-        <w:t>em</w:t>
-      </w:r>
-      <w:r>
-        <w:t xml:space="preserve"> določilo ime skupine (gitea-server-sg) in vnes</w:t>
-      </w:r>
-      <w:r>
-        <w:t>el</w:t>
-      </w:r>
-      <w:r>
-        <w:t xml:space="preserve"> opis, ki jasno označuje namen dostopa do Gitea strežnika in SSH povezave. Pri nastavitvi navideznega zasebnega oblaka (VPC) se</w:t>
-      </w:r>
-      <w:r>
-        <w:t>m</w:t>
-      </w:r>
-      <w:r>
-        <w:t xml:space="preserve"> ohranil privzet</w:t>
-      </w:r>
-      <w:r>
-        <w:t>e</w:t>
-      </w:r>
-      <w:r>
-        <w:t xml:space="preserve"> nastavit</w:t>
-      </w:r>
-      <w:r>
-        <w:t>ve</w:t>
-      </w:r>
-      <w:r>
-        <w:t xml:space="preserve">.  </w:t>
+        <w:t xml:space="preserve">Za zagotovitev varnega delovanja strežnika sem najprej pristopilo k ustvarjanju nove varnostne skupine (ang. Security Group). S klikom na gumb »Create security group« sem določilo ime skupine (gitea-server-sg) in vnesel opis, ki jasno označuje namen dostopa do Gitea strežnika in SSH povezave. Pri nastavitvi navideznega zasebnega oblaka (VPC) sem ohranil privzete nastavitve.  </w:t>
       </w:r>
     </w:p>
     <w:p>
@@ -3136,55 +3077,7 @@
         <w:ind w:left="9" w:right="194"/>
       </w:pPr>
       <w:r>
-        <w:t>V drugem koraku se</w:t>
-      </w:r>
-      <w:r>
-        <w:t>m</w:t>
-      </w:r>
-      <w:r>
-        <w:t xml:space="preserve"> izved</w:t>
-      </w:r>
-      <w:r>
-        <w:t>e</w:t>
-      </w:r>
-      <w:r>
-        <w:t>l konfiguracij</w:t>
-      </w:r>
-      <w:r>
-        <w:t>o</w:t>
-      </w:r>
-      <w:r>
-        <w:t xml:space="preserve"> vhodnih pravil (</w:t>
-      </w:r>
-      <w:r>
-        <w:t xml:space="preserve">ang. </w:t>
-      </w:r>
-      <w:r>
-        <w:t xml:space="preserve">Inbound Rules), ki predstavljajo ključni del varnostne infrastrukture, saj se z njimi natančno </w:t>
-      </w:r>
-      <w:r>
-        <w:t>opredeli</w:t>
-      </w:r>
-      <w:r>
-        <w:t xml:space="preserve">, kateri promet lahko </w:t>
-      </w:r>
-      <w:r>
-        <w:t>gre</w:t>
-      </w:r>
-      <w:r>
-        <w:t xml:space="preserve"> </w:t>
-      </w:r>
-      <w:r>
-        <w:t>čez</w:t>
-      </w:r>
-      <w:r>
-        <w:t xml:space="preserve"> strežnik. Za zagotavljanje varnega in funkcionalnega okolja s</w:t>
-      </w:r>
-      <w:r>
-        <w:t>em</w:t>
-      </w:r>
-      <w:r>
-        <w:t xml:space="preserve"> dodala naslednja pravila:  </w:t>
+        <w:t xml:space="preserve">V drugem koraku sem izvedel konfiguracijo vhodnih pravil (ang. Inbound Rules), ki predstavljajo ključni del varnostne infrastrukture, saj se z njimi natančno opredeli, kateri promet lahko gre čez strežnik. Za zagotavljanje varnega in funkcionalnega okolja sem dodala naslednja pravila:  </w:t>
       </w:r>
     </w:p>
     <w:p>
@@ -3203,31 +3096,7 @@
         <w:ind w:right="194"/>
       </w:pPr>
       <w:r>
-        <w:t>SSH (TCP, vrata 22): Za »Source« se</w:t>
-      </w:r>
-      <w:r>
-        <w:t>m</w:t>
-      </w:r>
-      <w:r>
-        <w:t xml:space="preserve"> izbral »My IP«, s čimer se je omejil dostop do terminala </w:t>
-      </w:r>
-      <w:r>
-        <w:t>samo</w:t>
-      </w:r>
-      <w:r>
-        <w:t xml:space="preserve"> </w:t>
-      </w:r>
-      <w:r>
-        <w:t>i</w:t>
-      </w:r>
-      <w:r>
-        <w:t>z</w:t>
-      </w:r>
-      <w:r>
-        <w:t xml:space="preserve"> mojega</w:t>
-      </w:r>
-      <w:r>
-        <w:t xml:space="preserve"> osebnega računalnika.  </w:t>
+        <w:t xml:space="preserve">SSH (TCP, vrata 22): Za »Source« sem izbral »My IP«, s čimer se je omejil dostop do terminala samo iz mojega osebnega računalnika.  </w:t>
       </w:r>
     </w:p>
     <w:p>
@@ -3296,28 +3165,7 @@
         <w:ind w:left="9" w:right="194"/>
       </w:pPr>
       <w:r>
-        <w:t>S tovrstno konfiguracijo se</w:t>
-      </w:r>
-      <w:r>
-        <w:t>m</w:t>
-      </w:r>
-      <w:r>
-        <w:t xml:space="preserve"> zagotovil, da so javno dostopn</w:t>
-      </w:r>
-      <w:r>
-        <w:t>a</w:t>
-      </w:r>
-      <w:r>
-        <w:t xml:space="preserve"> zgolj tisti </w:t>
-      </w:r>
-      <w:r>
-        <w:t>vrata (ang. Ports)</w:t>
-      </w:r>
-      <w:r>
-        <w:t>, ki so nujno potrebni za delovanje Gitea, medtem ko je administrativni dostop do strežnika ustrezno zavarovan.</w:t>
-      </w:r>
-      <w:r>
-        <w:t xml:space="preserve"> </w:t>
+        <w:t xml:space="preserve">S tovrstno konfiguracijo sem zagotovil, da so javno dostopna zgolj tisti vrata (ang. Ports), ki so nujno potrebni za delovanje Gitea, medtem ko je administrativni dostop do strežnika ustrezno zavarovan. </w:t>
       </w:r>
     </w:p>
     <w:p>
@@ -3482,13 +3330,7 @@
         <w:jc w:val="center"/>
       </w:pPr>
       <w:r>
-        <w:t xml:space="preserve">Vir: </w:t>
-      </w:r>
-      <w:r>
-        <w:t>Lasten</w:t>
-      </w:r>
-      <w:r>
-        <w:t xml:space="preserve">. </w:t>
+        <w:t xml:space="preserve">Vir: Lasten. </w:t>
       </w:r>
     </w:p>
     <w:p>
@@ -3535,25 +3377,7 @@
         <w:ind w:left="9" w:right="194"/>
       </w:pPr>
       <w:r>
-        <w:t>Za gostovanje Gitea strežnika se</w:t>
-      </w:r>
-      <w:r>
-        <w:t xml:space="preserve">m </w:t>
-      </w:r>
-      <w:r>
-        <w:t>izbral virtualn</w:t>
-      </w:r>
-      <w:r>
-        <w:t>o</w:t>
-      </w:r>
-      <w:r>
-        <w:t xml:space="preserve"> instanc</w:t>
-      </w:r>
-      <w:r>
-        <w:t>o</w:t>
-      </w:r>
-      <w:r>
-        <w:t xml:space="preserve"> v okviru storitve Amazon EC2. </w:t>
+        <w:t xml:space="preserve">Za gostovanje Gitea strežnika sem izbral virtualno instanco v okviru storitve Amazon EC2. </w:t>
       </w:r>
     </w:p>
     <w:p>
@@ -4373,19 +4197,7 @@
         <w:rPr>
           <w:color w:val="auto"/>
         </w:rPr>
-        <w:t>Ko sem</w:t>
-      </w:r>
-      <w:r>
-        <w:rPr>
-          <w:color w:val="auto"/>
-        </w:rPr>
-        <w:t xml:space="preserve"> uspešno</w:t>
-      </w:r>
-      <w:r>
-        <w:rPr>
-          <w:color w:val="auto"/>
-        </w:rPr>
-        <w:t xml:space="preserve"> pripravil delovno okolje, sem nadaljeval z ustvarjanjem konfiguracijske datoteke, ki definira parametre za poganjanje Gitea strežnika. Za to sem v mapi ~/gitea s pomočjo urejevalnika nano ustvaril datoteko docker-compose.yml.</w:t>
+        <w:t>Ko sem uspešno pripravil delovno okolje, sem nadaljeval z ustvarjanjem konfiguracijske datoteke, ki definira parametre za poganjanje Gitea strežnika. Za to sem v mapi ~/gitea s pomočjo urejevalnika nano ustvaril datoteko docker-compose.yml.</w:t>
       </w:r>
     </w:p>
     <w:p>
@@ -5166,13 +4978,7 @@
         <w:rPr>
           <w:rFonts w:eastAsia="Calibri"/>
         </w:rPr>
-        <w:t>Datoteko sem shranil. Nato sem s pogonom ukaza docker-compose up -d zagnal Gitea v ozadju. Delovanje sistema sem preveril z ukazom docker ps, s katerim sem potrdil, da je status kontejnerja »Up«, kar pomeni, da strežnik pravilno deluje in je pripravljen na začetno nastavitev v spletnem brskalniku.</w:t>
-      </w:r>
-      <w:r>
-        <w:rPr>
-          <w:rFonts w:eastAsia="Calibri"/>
-        </w:rPr>
-        <w:t xml:space="preserve"> </w:t>
+        <w:t xml:space="preserve">Datoteko sem shranil. Nato sem s pogonom ukaza docker-compose up -d zagnal Gitea v ozadju. Delovanje sistema sem preveril z ukazom docker ps, s katerim sem potrdil, da je status kontejnerja »Up«, kar pomeni, da strežnik pravilno deluje in je pripravljen na začetno nastavitev v spletnem brskalniku. </w:t>
       </w:r>
     </w:p>
     <w:p>
@@ -6129,6 +5935,63 @@
         <w:t>ZAKLJUČEK</w:t>
       </w:r>
       <w:bookmarkEnd w:id="17"/>
+    </w:p>
+    <w:p/>
+    <w:p>
+      <w:r>
+        <w:t xml:space="preserve">Z izdelavo </w:t>
+      </w:r>
+      <w:r>
+        <w:t xml:space="preserve">te </w:t>
+      </w:r>
+      <w:r>
+        <w:t>projektne naloge sem uspešno dosegel zastavljeni cilj vzpostavit</w:t>
+      </w:r>
+      <w:r>
+        <w:t>ve</w:t>
+      </w:r>
+      <w:r>
+        <w:t xml:space="preserve"> funkcionalnega strežnika Gitea na Amazon EC2. Proces mi je omogočil praktično razumevanje oblačnih storitev in uporab</w:t>
+      </w:r>
+      <w:r>
+        <w:t>o</w:t>
+      </w:r>
+      <w:r>
+        <w:t xml:space="preserve"> orodja Docker, ki sem ga izbral zaradi izolacije okolja in enostavnega vzdrževanja.</w:t>
+      </w:r>
+    </w:p>
+    <w:p/>
+    <w:p>
+      <w:pPr>
+        <w:ind w:left="4" w:firstLine="0"/>
+      </w:pPr>
+      <w:r>
+        <w:t>Z ustrezno konfiguracijo varnostnih skupin sem zagotovil varen dostop do sistema, hkrati pa s</w:t>
+      </w:r>
+      <w:r>
+        <w:t>em z zaključno</w:t>
+      </w:r>
+      <w:r>
+        <w:t xml:space="preserve"> nastavitvijo v brskalniku vzpostavil stabilno razvojno okolje. Pridobljene izkušnje pri upravljanju virtualnih virov in </w:t>
+      </w:r>
+      <w:r>
+        <w:t>o</w:t>
+      </w:r>
+      <w:r>
+        <w:t>mrežnih pravil so zame ključne</w:t>
+      </w:r>
+      <w:r>
+        <w:t>ga pomena</w:t>
+      </w:r>
+      <w:r>
+        <w:t xml:space="preserve"> za nadaljnje delo na področju računalništva v oblaku, saj sem uspel </w:t>
+      </w:r>
+      <w:r>
+        <w:t>vzpostaviti</w:t>
+      </w:r>
+      <w:r>
+        <w:t xml:space="preserve"> rešitev, ki v celoti sledi sodobnim tehničnim standardom.</w:t>
+      </w:r>
     </w:p>
     <w:p/>
     <w:p/>
@@ -6168,8 +6031,6 @@
     <w:p/>
     <w:p/>
     <w:p/>
-    <w:p/>
-    <w:p/>
     <w:p>
       <w:pPr>
         <w:spacing w:after="64" w:line="259" w:lineRule="auto"/>
@@ -6187,7 +6048,6 @@
       </w:pPr>
       <w:bookmarkStart w:id="18" w:name="_Toc228315164"/>
       <w:r>
-        <w:lastRenderedPageBreak/>
         <w:t>SEZNAM VIROV</w:t>
       </w:r>
       <w:bookmarkEnd w:id="18"/>
@@ -7973,6 +7833,7 @@
   <w:style w:type="character" w:default="1" w:styleId="DefaultParagraphFont">
     <w:name w:val="Default Paragraph Font"/>
     <w:uiPriority w:val="1"/>
+    <w:semiHidden/>
     <w:unhideWhenUsed/>
   </w:style>
   <w:style w:type="table" w:default="1" w:styleId="TableNormal">

</xml_diff>